<commit_message>
Add chatbot retrieval pipeline
</commit_message>
<xml_diff>
--- a/data/all_documents/Employee Leave Policy.docx
+++ b/data/all_documents/Employee Leave Policy.docx
@@ -17,10 +17,7 @@
         <w:t xml:space="preserve">Employees are entitled to </w:t>
       </w:r>
       <w:r>
-        <w:t>4</w:t>
-      </w:r>
-      <w:r>
-        <w:t>7</w:t>
+        <w:t>47</w:t>
       </w:r>
       <w:r>
         <w:t xml:space="preserve"> </w:t>
@@ -56,6 +53,22 @@
     <w:p>
       <w:r>
         <w:t>All leave requests require manager approval.</w:t>
+      </w:r>
+    </w:p>
+    <w:p>
+      <w:r>
+        <w:t>Eligibility</w:t>
+      </w:r>
+    </w:p>
+    <w:p>
+      <w:r>
+        <w:t xml:space="preserve">All regular employee </w:t>
+      </w:r>
+      <w:r>
+        <w:t>is</w:t>
+      </w:r>
+      <w:r>
+        <w:t xml:space="preserve"> entitled to the leave listed above.</w:t>
       </w:r>
     </w:p>
     <w:p/>

</xml_diff>